<commit_message>
Made some minor edits
</commit_message>
<xml_diff>
--- a/Документация разработчика.docx
+++ b/Документация разработчика.docx
@@ -558,7 +558,7 @@
           <w:r>
             <w:fldChar w:fldCharType="separate"/>
           </w:r>
-          <w:hyperlink w:anchor="_Toc232467552" w:history="1">
+          <w:hyperlink w:anchor="_Toc232852859" w:history="1">
             <w:r>
               <w:rPr>
                 <w:rStyle w:val="a7"/>
@@ -586,7 +586,7 @@
                 <w:noProof/>
                 <w:webHidden/>
               </w:rPr>
-              <w:instrText xml:space="preserve"> PAGEREF _Toc232467552 \h </w:instrText>
+              <w:instrText xml:space="preserve"> PAGEREF _Toc232852859 \h </w:instrText>
             </w:r>
             <w:r>
               <w:rPr>
@@ -631,7 +631,7 @@
               <w14:ligatures w14:val="none"/>
             </w:rPr>
           </w:pPr>
-          <w:hyperlink w:anchor="_Toc232467553" w:history="1">
+          <w:hyperlink w:anchor="_Toc232852860" w:history="1">
             <w:r>
               <w:rPr>
                 <w:rStyle w:val="a7"/>
@@ -659,7 +659,7 @@
                 <w:noProof/>
                 <w:webHidden/>
               </w:rPr>
-              <w:instrText xml:space="preserve"> PAGEREF _Toc232467553 \h </w:instrText>
+              <w:instrText xml:space="preserve"> PAGEREF _Toc232852860 \h </w:instrText>
             </w:r>
             <w:r>
               <w:rPr>
@@ -704,7 +704,7 @@
               <w14:ligatures w14:val="none"/>
             </w:rPr>
           </w:pPr>
-          <w:hyperlink w:anchor="_Toc232467554" w:history="1">
+          <w:hyperlink w:anchor="_Toc232852861" w:history="1">
             <w:r>
               <w:rPr>
                 <w:rStyle w:val="a7"/>
@@ -732,7 +732,7 @@
                 <w:noProof/>
                 <w:webHidden/>
               </w:rPr>
-              <w:instrText xml:space="preserve"> PAGEREF _Toc232467554 \h </w:instrText>
+              <w:instrText xml:space="preserve"> PAGEREF _Toc232852861 \h </w:instrText>
             </w:r>
             <w:r>
               <w:rPr>
@@ -777,7 +777,7 @@
               <w14:ligatures w14:val="none"/>
             </w:rPr>
           </w:pPr>
-          <w:hyperlink w:anchor="_Toc232467555" w:history="1">
+          <w:hyperlink w:anchor="_Toc232852862" w:history="1">
             <w:r>
               <w:rPr>
                 <w:rStyle w:val="a7"/>
@@ -804,7 +804,7 @@
                 <w:noProof/>
                 <w:webHidden/>
               </w:rPr>
-              <w:instrText xml:space="preserve"> PAGEREF _Toc232467555 \h </w:instrText>
+              <w:instrText xml:space="preserve"> PAGEREF _Toc232852862 \h </w:instrText>
             </w:r>
             <w:r>
               <w:rPr>
@@ -849,7 +849,7 @@
               <w14:ligatures w14:val="none"/>
             </w:rPr>
           </w:pPr>
-          <w:hyperlink w:anchor="_Toc232467556" w:history="1">
+          <w:hyperlink w:anchor="_Toc232852863" w:history="1">
             <w:r>
               <w:rPr>
                 <w:rStyle w:val="a7"/>
@@ -876,7 +876,7 @@
                 <w:noProof/>
                 <w:webHidden/>
               </w:rPr>
-              <w:instrText xml:space="preserve"> PAGEREF _Toc232467556 \h </w:instrText>
+              <w:instrText xml:space="preserve"> PAGEREF _Toc232852863 \h </w:instrText>
             </w:r>
             <w:r>
               <w:rPr>
@@ -921,13 +921,13 @@
               <w14:ligatures w14:val="none"/>
             </w:rPr>
           </w:pPr>
-          <w:hyperlink w:anchor="_Toc232467557" w:history="1">
+          <w:hyperlink w:anchor="_Toc232852864" w:history="1">
             <w:r>
               <w:rPr>
                 <w:rStyle w:val="a7"/>
                 <w:noProof/>
               </w:rPr>
-              <w:t>2.3 StatisticsManager</w:t>
+              <w:t>2.3 MainWindow</w:t>
             </w:r>
             <w:r>
               <w:rPr>
@@ -948,79 +948,7 @@
                 <w:noProof/>
                 <w:webHidden/>
               </w:rPr>
-              <w:instrText xml:space="preserve"> PAGEREF _Toc232467557 \h </w:instrText>
-            </w:r>
-            <w:r>
-              <w:rPr>
-                <w:noProof/>
-                <w:webHidden/>
-              </w:rPr>
-            </w:r>
-            <w:r>
-              <w:rPr>
-                <w:noProof/>
-                <w:webHidden/>
-              </w:rPr>
-              <w:fldChar w:fldCharType="separate"/>
-            </w:r>
-            <w:r>
-              <w:rPr>
-                <w:noProof/>
-                <w:webHidden/>
-              </w:rPr>
-              <w:t>3</w:t>
-            </w:r>
-            <w:r>
-              <w:rPr>
-                <w:noProof/>
-                <w:webHidden/>
-              </w:rPr>
-              <w:fldChar w:fldCharType="end"/>
-            </w:r>
-          </w:hyperlink>
-        </w:p>
-        <w:p>
-          <w:pPr>
-            <w:pStyle w:val="31"/>
-            <w:tabs>
-              <w:tab w:val="right" w:leader="dot" w:pos="9345"/>
-            </w:tabs>
-            <w:rPr>
-              <w:rFonts w:eastAsiaTheme="minorEastAsia"/>
-              <w:noProof/>
-              <w:kern w:val="0"/>
-              <w:lang w:eastAsia="ru-RU"/>
-              <w14:ligatures w14:val="none"/>
-            </w:rPr>
-          </w:pPr>
-          <w:hyperlink w:anchor="_Toc232467558" w:history="1">
-            <w:r>
-              <w:rPr>
-                <w:rStyle w:val="a7"/>
-                <w:noProof/>
-              </w:rPr>
-              <w:t>2.4 MainWindow</w:t>
-            </w:r>
-            <w:r>
-              <w:rPr>
-                <w:noProof/>
-                <w:webHidden/>
-              </w:rPr>
-              <w:tab/>
-            </w:r>
-            <w:r>
-              <w:rPr>
-                <w:noProof/>
-                <w:webHidden/>
-              </w:rPr>
-              <w:fldChar w:fldCharType="begin"/>
-            </w:r>
-            <w:r>
-              <w:rPr>
-                <w:noProof/>
-                <w:webHidden/>
-              </w:rPr>
-              <w:instrText xml:space="preserve"> PAGEREF _Toc232467558 \h </w:instrText>
+              <w:instrText xml:space="preserve"> PAGEREF _Toc232852864 \h </w:instrText>
             </w:r>
             <w:r>
               <w:rPr>
@@ -1065,7 +993,7 @@
               <w14:ligatures w14:val="none"/>
             </w:rPr>
           </w:pPr>
-          <w:hyperlink w:anchor="_Toc232467559" w:history="1">
+          <w:hyperlink w:anchor="_Toc232852865" w:history="1">
             <w:r>
               <w:rPr>
                 <w:rStyle w:val="a7"/>
@@ -1093,7 +1021,80 @@
                 <w:noProof/>
                 <w:webHidden/>
               </w:rPr>
-              <w:instrText xml:space="preserve"> PAGEREF _Toc232467559 \h </w:instrText>
+              <w:instrText xml:space="preserve"> PAGEREF _Toc232852865 \h </w:instrText>
+            </w:r>
+            <w:r>
+              <w:rPr>
+                <w:noProof/>
+                <w:webHidden/>
+              </w:rPr>
+            </w:r>
+            <w:r>
+              <w:rPr>
+                <w:noProof/>
+                <w:webHidden/>
+              </w:rPr>
+              <w:fldChar w:fldCharType="separate"/>
+            </w:r>
+            <w:r>
+              <w:rPr>
+                <w:noProof/>
+                <w:webHidden/>
+              </w:rPr>
+              <w:t>3</w:t>
+            </w:r>
+            <w:r>
+              <w:rPr>
+                <w:noProof/>
+                <w:webHidden/>
+              </w:rPr>
+              <w:fldChar w:fldCharType="end"/>
+            </w:r>
+          </w:hyperlink>
+        </w:p>
+        <w:p>
+          <w:pPr>
+            <w:pStyle w:val="21"/>
+            <w:tabs>
+              <w:tab w:val="right" w:leader="dot" w:pos="9345"/>
+            </w:tabs>
+            <w:rPr>
+              <w:rFonts w:eastAsiaTheme="minorEastAsia"/>
+              <w:noProof/>
+              <w:kern w:val="0"/>
+              <w:lang w:eastAsia="ru-RU"/>
+              <w14:ligatures w14:val="none"/>
+            </w:rPr>
+          </w:pPr>
+          <w:hyperlink w:anchor="_Toc232852866" w:history="1">
+            <w:r>
+              <w:rPr>
+                <w:rStyle w:val="a7"/>
+                <w:rFonts w:ascii="Times New Roman" w:hAnsi="Times New Roman" w:cs="Times New Roman"/>
+                <w:noProof/>
+              </w:rPr>
+              <w:t>4. Используемые технологии</w:t>
+            </w:r>
+            <w:r>
+              <w:rPr>
+                <w:noProof/>
+                <w:webHidden/>
+              </w:rPr>
+              <w:tab/>
+            </w:r>
+            <w:r>
+              <w:rPr>
+                <w:noProof/>
+                <w:webHidden/>
+              </w:rPr>
+              <w:fldChar w:fldCharType="begin"/>
+            </w:r>
+            <w:r>
+              <w:rPr>
+                <w:noProof/>
+                <w:webHidden/>
+              </w:rPr>
+              <w:instrText xml:space="preserve"> PAGEREF _Toc232852866 \h </w:instrText>
             </w:r>
             <w:r>
               <w:rPr>
@@ -1138,80 +1139,7 @@
               <w14:ligatures w14:val="none"/>
             </w:rPr>
           </w:pPr>
-          <w:hyperlink w:anchor="_Toc232467560" w:history="1">
-            <w:r>
-              <w:rPr>
-                <w:rStyle w:val="a7"/>
-                <w:rFonts w:ascii="Times New Roman" w:hAnsi="Times New Roman" w:cs="Times New Roman"/>
-                <w:noProof/>
-              </w:rPr>
-              <w:t>4. Используемые технологии</w:t>
-            </w:r>
-            <w:r>
-              <w:rPr>
-                <w:noProof/>
-                <w:webHidden/>
-              </w:rPr>
-              <w:tab/>
-            </w:r>
-            <w:r>
-              <w:rPr>
-                <w:noProof/>
-                <w:webHidden/>
-              </w:rPr>
-              <w:fldChar w:fldCharType="begin"/>
-            </w:r>
-            <w:r>
-              <w:rPr>
-                <w:noProof/>
-                <w:webHidden/>
-              </w:rPr>
-              <w:instrText xml:space="preserve"> PAGEREF _Toc232467560 \h </w:instrText>
-            </w:r>
-            <w:r>
-              <w:rPr>
-                <w:noProof/>
-                <w:webHidden/>
-              </w:rPr>
-            </w:r>
-            <w:r>
-              <w:rPr>
-                <w:noProof/>
-                <w:webHidden/>
-              </w:rPr>
-              <w:fldChar w:fldCharType="separate"/>
-            </w:r>
-            <w:r>
-              <w:rPr>
-                <w:noProof/>
-                <w:webHidden/>
-              </w:rPr>
-              <w:t>4</w:t>
-            </w:r>
-            <w:r>
-              <w:rPr>
-                <w:noProof/>
-                <w:webHidden/>
-              </w:rPr>
-              <w:fldChar w:fldCharType="end"/>
-            </w:r>
-          </w:hyperlink>
-        </w:p>
-        <w:p>
-          <w:pPr>
-            <w:pStyle w:val="21"/>
-            <w:tabs>
-              <w:tab w:val="right" w:leader="dot" w:pos="9345"/>
-            </w:tabs>
-            <w:rPr>
-              <w:rFonts w:eastAsiaTheme="minorEastAsia"/>
-              <w:noProof/>
-              <w:kern w:val="0"/>
-              <w:lang w:eastAsia="ru-RU"/>
-              <w14:ligatures w14:val="none"/>
-            </w:rPr>
-          </w:pPr>
-          <w:hyperlink w:anchor="_Toc232467561" w:history="1">
+          <w:hyperlink w:anchor="_Toc232852867" w:history="1">
             <w:r>
               <w:rPr>
                 <w:rStyle w:val="a7"/>
@@ -1239,7 +1167,7 @@
                 <w:noProof/>
                 <w:webHidden/>
               </w:rPr>
-              <w:instrText xml:space="preserve"> PAGEREF _Toc232467561 \h </w:instrText>
+              <w:instrText xml:space="preserve"> PAGEREF _Toc232852867 \h </w:instrText>
             </w:r>
             <w:r>
               <w:rPr>
@@ -1317,7 +1245,7 @@
           <w:szCs w:val="28"/>
         </w:rPr>
       </w:pPr>
-      <w:bookmarkStart w:id="0" w:name="_Toc232467552"/>
+      <w:bookmarkStart w:id="0" w:name="_Toc232852859"/>
       <w:r>
         <w:rPr>
           <w:rFonts w:ascii="Times New Roman" w:hAnsi="Times New Roman" w:cs="Times New Roman"/>
@@ -1338,7 +1266,7 @@
           <w:szCs w:val="28"/>
         </w:rPr>
       </w:pPr>
-      <w:bookmarkStart w:id="1" w:name="_Toc232467553"/>
+      <w:bookmarkStart w:id="1" w:name="_Toc232852860"/>
       <w:r>
         <w:rPr>
           <w:rFonts w:ascii="Times New Roman" w:hAnsi="Times New Roman" w:cs="Times New Roman"/>
@@ -1467,31 +1395,6 @@
     </w:p>
     <w:p>
       <w:pPr>
-        <w:pStyle w:val="a3"/>
-        <w:numPr>
-          <w:ilvl w:val="0"/>
-          <w:numId w:val="20"/>
-        </w:numPr>
-      </w:pPr>
-      <w:r>
-        <w:rPr>
-          <w:rStyle w:val="HTML1"/>
-        </w:rPr>
-        <w:t>statistics_manager.py</w:t>
-      </w:r>
-      <w:r>
-        <w:t xml:space="preserve"> — </w:t>
-      </w:r>
-      <w:r>
-        <w:rPr>
-          <w:sz w:val="28"/>
-          <w:szCs w:val="28"/>
-        </w:rPr>
-        <w:t>расчёт KPI</w:t>
-      </w:r>
-    </w:p>
-    <w:p>
-      <w:pPr>
         <w:pStyle w:val="2"/>
         <w:rPr>
           <w:rFonts w:ascii="Times New Roman" w:hAnsi="Times New Roman" w:cs="Times New Roman"/>
@@ -1499,7 +1402,7 @@
           <w:szCs w:val="28"/>
         </w:rPr>
       </w:pPr>
-      <w:bookmarkStart w:id="2" w:name="_Toc232467554"/>
+      <w:bookmarkStart w:id="2" w:name="_Toc232852861"/>
       <w:r>
         <w:rPr>
           <w:rFonts w:ascii="Times New Roman" w:hAnsi="Times New Roman" w:cs="Times New Roman"/>
@@ -1518,7 +1421,7 @@
           <w:szCs w:val="28"/>
         </w:rPr>
       </w:pPr>
-      <w:bookmarkStart w:id="3" w:name="_Toc232467555"/>
+      <w:bookmarkStart w:id="3" w:name="_Toc232852862"/>
       <w:r>
         <w:rPr>
           <w:sz w:val="28"/>
@@ -1641,7 +1544,7 @@
           <w:szCs w:val="28"/>
         </w:rPr>
       </w:pPr>
-      <w:bookmarkStart w:id="4" w:name="_Toc232467556"/>
+      <w:bookmarkStart w:id="4" w:name="_Toc232852863"/>
       <w:r>
         <w:rPr>
           <w:sz w:val="28"/>
@@ -1724,13 +1627,27 @@
           <w:szCs w:val="28"/>
         </w:rPr>
       </w:pPr>
-      <w:bookmarkStart w:id="5" w:name="_Toc232467557"/>
-      <w:r>
-        <w:rPr>
-          <w:sz w:val="28"/>
-          <w:szCs w:val="28"/>
-        </w:rPr>
-        <w:t xml:space="preserve">2.3 </w:t>
+      <w:bookmarkStart w:id="5" w:name="_Toc232852864"/>
+      <w:r>
+        <w:rPr>
+          <w:sz w:val="28"/>
+          <w:szCs w:val="28"/>
+        </w:rPr>
+        <w:t>2.</w:t>
+      </w:r>
+      <w:r>
+        <w:rPr>
+          <w:sz w:val="28"/>
+          <w:szCs w:val="28"/>
+        </w:rPr>
+        <w:t>3</w:t>
+      </w:r>
+      <w:r>
+        <w:rPr>
+          <w:sz w:val="28"/>
+          <w:szCs w:val="28"/>
+        </w:rPr>
+        <w:t xml:space="preserve"> </w:t>
       </w:r>
       <w:proofErr w:type="spellStart"/>
       <w:r>
@@ -1738,112 +1655,9 @@
           <w:sz w:val="28"/>
           <w:szCs w:val="28"/>
         </w:rPr>
-        <w:t>StatisticsManager</w:t>
+        <w:t>MainWindow</w:t>
       </w:r>
       <w:bookmarkEnd w:id="5"/>
-      <w:proofErr w:type="spellEnd"/>
-    </w:p>
-    <w:p>
-      <w:pPr>
-        <w:pStyle w:val="a3"/>
-        <w:rPr>
-          <w:sz w:val="28"/>
-          <w:szCs w:val="28"/>
-        </w:rPr>
-      </w:pPr>
-      <w:r>
-        <w:rPr>
-          <w:sz w:val="28"/>
-          <w:szCs w:val="28"/>
-        </w:rPr>
-        <w:t>Выполняет расчёт KPI:</w:t>
-      </w:r>
-    </w:p>
-    <w:p>
-      <w:pPr>
-        <w:pStyle w:val="a3"/>
-        <w:numPr>
-          <w:ilvl w:val="0"/>
-          <w:numId w:val="23"/>
-        </w:numPr>
-        <w:rPr>
-          <w:sz w:val="28"/>
-          <w:szCs w:val="28"/>
-        </w:rPr>
-      </w:pPr>
-      <w:r>
-        <w:rPr>
-          <w:sz w:val="28"/>
-          <w:szCs w:val="28"/>
-        </w:rPr>
-        <w:t>общее количество записей</w:t>
-      </w:r>
-    </w:p>
-    <w:p>
-      <w:pPr>
-        <w:pStyle w:val="a3"/>
-        <w:numPr>
-          <w:ilvl w:val="0"/>
-          <w:numId w:val="23"/>
-        </w:numPr>
-        <w:rPr>
-          <w:sz w:val="28"/>
-          <w:szCs w:val="28"/>
-        </w:rPr>
-      </w:pPr>
-      <w:r>
-        <w:rPr>
-          <w:sz w:val="28"/>
-          <w:szCs w:val="28"/>
-        </w:rPr>
-        <w:t>количество побед атакующих</w:t>
-      </w:r>
-    </w:p>
-    <w:p>
-      <w:pPr>
-        <w:pStyle w:val="a3"/>
-        <w:numPr>
-          <w:ilvl w:val="0"/>
-          <w:numId w:val="23"/>
-        </w:numPr>
-        <w:rPr>
-          <w:sz w:val="28"/>
-          <w:szCs w:val="28"/>
-        </w:rPr>
-      </w:pPr>
-      <w:r>
-        <w:rPr>
-          <w:sz w:val="28"/>
-          <w:szCs w:val="28"/>
-        </w:rPr>
-        <w:t>количество побед защитников</w:t>
-      </w:r>
-    </w:p>
-    <w:p>
-      <w:pPr>
-        <w:pStyle w:val="3"/>
-        <w:rPr>
-          <w:sz w:val="28"/>
-          <w:szCs w:val="28"/>
-        </w:rPr>
-      </w:pPr>
-      <w:bookmarkStart w:id="6" w:name="_Toc232467558"/>
-      <w:r>
-        <w:rPr>
-          <w:sz w:val="28"/>
-          <w:szCs w:val="28"/>
-        </w:rPr>
-        <w:t xml:space="preserve">2.4 </w:t>
-      </w:r>
-      <w:proofErr w:type="spellStart"/>
-      <w:r>
-        <w:rPr>
-          <w:sz w:val="28"/>
-          <w:szCs w:val="28"/>
-        </w:rPr>
-        <w:t>MainWindow</w:t>
-      </w:r>
-      <w:bookmarkEnd w:id="6"/>
       <w:proofErr w:type="spellEnd"/>
     </w:p>
     <w:p>
@@ -1971,112 +1785,628 @@
           <w:szCs w:val="28"/>
         </w:rPr>
       </w:pPr>
-      <w:bookmarkStart w:id="7" w:name="_Toc232467559"/>
+      <w:bookmarkStart w:id="6" w:name="_Toc232852865"/>
       <w:r>
         <w:rPr>
           <w:rFonts w:ascii="Times New Roman" w:hAnsi="Times New Roman" w:cs="Times New Roman"/>
           <w:sz w:val="28"/>
           <w:szCs w:val="28"/>
         </w:rPr>
-        <w:lastRenderedPageBreak/>
         <w:t>3. Поток данных</w:t>
       </w:r>
-      <w:bookmarkEnd w:id="7"/>
+      <w:bookmarkEnd w:id="6"/>
     </w:p>
     <w:p>
       <w:pPr>
-        <w:pStyle w:val="HTML"/>
-        <w:rPr>
-          <w:lang w:val="en-US"/>
-        </w:rPr>
-      </w:pPr>
-      <w:r>
         <w:rPr>
           <w:rStyle w:val="HTML1"/>
-          <w:lang w:val="en-US"/>
-        </w:rPr>
-        <w:t xml:space="preserve">CSV → </w:t>
+          <w:rFonts w:eastAsiaTheme="minorHAnsi"/>
+          <w:kern w:val="0"/>
+          <w:lang w:val="en-US" w:eastAsia="ru-RU"/>
+          <w14:ligatures w14:val="none"/>
+        </w:rPr>
+      </w:pPr>
+      <w:r>
+        <w:rPr>
+          <w:rStyle w:val="HTML1"/>
+          <w:rFonts w:eastAsiaTheme="minorHAnsi"/>
+          <w:kern w:val="0"/>
+          <w:lang w:val="en-US" w:eastAsia="ru-RU"/>
+          <w14:ligatures w14:val="none"/>
+        </w:rPr>
+        <w:t xml:space="preserve">CSV </w:t>
       </w:r>
       <w:proofErr w:type="spellStart"/>
       <w:r>
         <w:rPr>
           <w:rStyle w:val="HTML1"/>
-          <w:lang w:val="en-US"/>
-        </w:rPr>
-        <w:t>DataManager</w:t>
+          <w:rFonts w:eastAsiaTheme="minorHAnsi"/>
+          <w:kern w:val="0"/>
+          <w:lang w:val="en-US" w:eastAsia="ru-RU"/>
+          <w14:ligatures w14:val="none"/>
+        </w:rPr>
+        <w:t>файл</w:t>
       </w:r>
       <w:proofErr w:type="spellEnd"/>
-      <w:r>
-        <w:rPr>
-          <w:rStyle w:val="HTML1"/>
-          <w:lang w:val="en-US"/>
-        </w:rPr>
-        <w:t xml:space="preserve"> → </w:t>
-      </w:r>
-      <w:r>
-        <w:rPr>
-          <w:rStyle w:val="HTML1"/>
-        </w:rPr>
-        <w:t>фильтрация</w:t>
-      </w:r>
-      <w:r>
-        <w:rPr>
-          <w:rStyle w:val="HTML1"/>
-          <w:lang w:val="en-US"/>
-        </w:rPr>
-        <w:t xml:space="preserve"> → </w:t>
-      </w:r>
-      <w:proofErr w:type="spellStart"/>
-      <w:r>
-        <w:rPr>
-          <w:rStyle w:val="HTML1"/>
-          <w:lang w:val="en-US"/>
-        </w:rPr>
-        <w:t>MainWindow</w:t>
-      </w:r>
-      <w:proofErr w:type="spellEnd"/>
-      <w:r>
-        <w:rPr>
-          <w:rStyle w:val="HTML1"/>
-          <w:lang w:val="en-US"/>
-        </w:rPr>
-        <w:t xml:space="preserve"> → </w:t>
-      </w:r>
-      <w:proofErr w:type="spellStart"/>
-      <w:r>
-        <w:rPr>
-          <w:rStyle w:val="HTML1"/>
-          <w:lang w:val="en-US"/>
-        </w:rPr>
-        <w:t>StatisticsManager</w:t>
-      </w:r>
-      <w:proofErr w:type="spellEnd"/>
-      <w:r>
-        <w:rPr>
-          <w:rStyle w:val="HTML1"/>
-          <w:lang w:val="en-US"/>
-        </w:rPr>
-        <w:t xml:space="preserve"> → </w:t>
-      </w:r>
-      <w:proofErr w:type="spellStart"/>
-      <w:r>
-        <w:rPr>
-          <w:rStyle w:val="HTML1"/>
-          <w:lang w:val="en-US"/>
-        </w:rPr>
-        <w:t>PlotManager</w:t>
-      </w:r>
-      <w:proofErr w:type="spellEnd"/>
-      <w:r>
-        <w:rPr>
-          <w:rStyle w:val="HTML1"/>
-          <w:lang w:val="en-US"/>
-        </w:rPr>
-        <w:t xml:space="preserve"> → UI</w:t>
-      </w:r>
     </w:p>
     <w:p>
       <w:pPr>
+        <w:rPr>
+          <w:rStyle w:val="HTML1"/>
+          <w:rFonts w:eastAsiaTheme="minorHAnsi"/>
+          <w:kern w:val="0"/>
+          <w:lang w:val="en-US" w:eastAsia="ru-RU"/>
+          <w14:ligatures w14:val="none"/>
+        </w:rPr>
+      </w:pPr>
+      <w:r>
+        <w:rPr>
+          <w:rStyle w:val="HTML1"/>
+          <w:rFonts w:eastAsiaTheme="minorHAnsi"/>
+          <w:kern w:val="0"/>
+          <w:lang w:val="en-US" w:eastAsia="ru-RU"/>
+          <w14:ligatures w14:val="none"/>
+        </w:rPr>
+        <w:t xml:space="preserve">    ↓</w:t>
+      </w:r>
+    </w:p>
+    <w:p>
+      <w:pPr>
+        <w:rPr>
+          <w:rStyle w:val="HTML1"/>
+          <w:rFonts w:eastAsiaTheme="minorHAnsi"/>
+          <w:kern w:val="0"/>
+          <w:lang w:val="en-US" w:eastAsia="ru-RU"/>
+          <w14:ligatures w14:val="none"/>
+        </w:rPr>
+      </w:pPr>
+      <w:proofErr w:type="spellStart"/>
+      <w:r>
+        <w:rPr>
+          <w:rStyle w:val="HTML1"/>
+          <w:rFonts w:eastAsiaTheme="minorHAnsi"/>
+          <w:kern w:val="0"/>
+          <w:lang w:val="en-US" w:eastAsia="ru-RU"/>
+          <w14:ligatures w14:val="none"/>
+        </w:rPr>
+        <w:t>DataManager.load_</w:t>
+      </w:r>
+      <w:proofErr w:type="gramStart"/>
+      <w:r>
+        <w:rPr>
+          <w:rStyle w:val="HTML1"/>
+          <w:rFonts w:eastAsiaTheme="minorHAnsi"/>
+          <w:kern w:val="0"/>
+          <w:lang w:val="en-US" w:eastAsia="ru-RU"/>
+          <w14:ligatures w14:val="none"/>
+        </w:rPr>
+        <w:t>csv</w:t>
+      </w:r>
+      <w:proofErr w:type="spellEnd"/>
+      <w:r>
+        <w:rPr>
+          <w:rStyle w:val="HTML1"/>
+          <w:rFonts w:eastAsiaTheme="minorHAnsi"/>
+          <w:kern w:val="0"/>
+          <w:lang w:val="en-US" w:eastAsia="ru-RU"/>
+          <w14:ligatures w14:val="none"/>
+        </w:rPr>
+        <w:t>(</w:t>
+      </w:r>
+      <w:proofErr w:type="gramEnd"/>
+      <w:r>
+        <w:rPr>
+          <w:rStyle w:val="HTML1"/>
+          <w:rFonts w:eastAsiaTheme="minorHAnsi"/>
+          <w:kern w:val="0"/>
+          <w:lang w:val="en-US" w:eastAsia="ru-RU"/>
+          <w14:ligatures w14:val="none"/>
+        </w:rPr>
+        <w:t>)</w:t>
+      </w:r>
+    </w:p>
+    <w:p>
+      <w:pPr>
+        <w:rPr>
+          <w:rStyle w:val="HTML1"/>
+          <w:rFonts w:eastAsiaTheme="minorHAnsi"/>
+          <w:kern w:val="0"/>
+          <w:lang w:val="en-US" w:eastAsia="ru-RU"/>
+          <w14:ligatures w14:val="none"/>
+        </w:rPr>
+      </w:pPr>
+      <w:r>
+        <w:rPr>
+          <w:rStyle w:val="HTML1"/>
+          <w:rFonts w:eastAsiaTheme="minorHAnsi"/>
+          <w:kern w:val="0"/>
+          <w:lang w:val="en-US" w:eastAsia="ru-RU"/>
+          <w14:ligatures w14:val="none"/>
+        </w:rPr>
+        <w:t xml:space="preserve">    ↓</w:t>
+      </w:r>
+    </w:p>
+    <w:p>
+      <w:pPr>
+        <w:rPr>
+          <w:rStyle w:val="HTML1"/>
+          <w:rFonts w:eastAsiaTheme="minorHAnsi"/>
+          <w:kern w:val="0"/>
+          <w:lang w:val="en-US" w:eastAsia="ru-RU"/>
+          <w14:ligatures w14:val="none"/>
+        </w:rPr>
+      </w:pPr>
+      <w:r>
+        <w:rPr>
+          <w:rStyle w:val="HTML1"/>
+          <w:rFonts w:eastAsiaTheme="minorHAnsi"/>
+          <w:kern w:val="0"/>
+          <w:lang w:val="en-US" w:eastAsia="ru-RU"/>
+          <w14:ligatures w14:val="none"/>
+        </w:rPr>
+        <w:t xml:space="preserve">Pandas </w:t>
+      </w:r>
+      <w:proofErr w:type="spellStart"/>
+      <w:r>
+        <w:rPr>
+          <w:rStyle w:val="HTML1"/>
+          <w:rFonts w:eastAsiaTheme="minorHAnsi"/>
+          <w:kern w:val="0"/>
+          <w:lang w:val="en-US" w:eastAsia="ru-RU"/>
+          <w14:ligatures w14:val="none"/>
+        </w:rPr>
+        <w:t>DataFrame</w:t>
+      </w:r>
+      <w:proofErr w:type="spellEnd"/>
+    </w:p>
+    <w:p>
+      <w:pPr>
+        <w:rPr>
+          <w:rStyle w:val="HTML1"/>
+          <w:rFonts w:eastAsiaTheme="minorHAnsi"/>
+          <w:kern w:val="0"/>
+          <w:lang w:val="en-US" w:eastAsia="ru-RU"/>
+          <w14:ligatures w14:val="none"/>
+        </w:rPr>
+      </w:pPr>
+      <w:r>
+        <w:rPr>
+          <w:rStyle w:val="HTML1"/>
+          <w:rFonts w:eastAsiaTheme="minorHAnsi"/>
+          <w:kern w:val="0"/>
+          <w:lang w:val="en-US" w:eastAsia="ru-RU"/>
+          <w14:ligatures w14:val="none"/>
+        </w:rPr>
+        <w:t xml:space="preserve">    ↓</w:t>
+      </w:r>
+    </w:p>
+    <w:p>
+      <w:pPr>
+        <w:rPr>
+          <w:rStyle w:val="HTML1"/>
+          <w:rFonts w:eastAsiaTheme="minorHAnsi"/>
+          <w:kern w:val="0"/>
+          <w:lang w:val="en-US" w:eastAsia="ru-RU"/>
+          <w14:ligatures w14:val="none"/>
+        </w:rPr>
+      </w:pPr>
+      <w:proofErr w:type="spellStart"/>
+      <w:r>
+        <w:rPr>
+          <w:rStyle w:val="HTML1"/>
+          <w:rFonts w:eastAsiaTheme="minorHAnsi"/>
+          <w:kern w:val="0"/>
+          <w:lang w:val="en-US" w:eastAsia="ru-RU"/>
+          <w14:ligatures w14:val="none"/>
+        </w:rPr>
+        <w:lastRenderedPageBreak/>
+        <w:t>MainWindow</w:t>
+      </w:r>
+      <w:proofErr w:type="spellEnd"/>
+    </w:p>
+    <w:p>
+      <w:pPr>
+        <w:rPr>
+          <w:rStyle w:val="HTML1"/>
+          <w:rFonts w:eastAsiaTheme="minorHAnsi"/>
+          <w:kern w:val="0"/>
+          <w:lang w:val="en-US" w:eastAsia="ru-RU"/>
+          <w14:ligatures w14:val="none"/>
+        </w:rPr>
+      </w:pPr>
+      <w:r>
+        <w:rPr>
+          <w:rStyle w:val="HTML1"/>
+          <w:rFonts w:eastAsiaTheme="minorHAnsi"/>
+          <w:kern w:val="0"/>
+          <w:lang w:val="en-US" w:eastAsia="ru-RU"/>
+          <w14:ligatures w14:val="none"/>
+        </w:rPr>
+        <w:t xml:space="preserve">    ↓</w:t>
+      </w:r>
+    </w:p>
+    <w:p>
+      <w:pPr>
+        <w:rPr>
+          <w:rStyle w:val="HTML1"/>
+          <w:rFonts w:eastAsiaTheme="minorHAnsi"/>
+          <w:kern w:val="0"/>
+          <w:lang w:val="en-US" w:eastAsia="ru-RU"/>
+          <w14:ligatures w14:val="none"/>
+        </w:rPr>
+      </w:pPr>
+      <w:proofErr w:type="spellStart"/>
+      <w:r>
+        <w:rPr>
+          <w:rStyle w:val="HTML1"/>
+          <w:rFonts w:eastAsiaTheme="minorHAnsi"/>
+          <w:kern w:val="0"/>
+          <w:lang w:val="en-US" w:eastAsia="ru-RU"/>
+          <w14:ligatures w14:val="none"/>
+        </w:rPr>
+        <w:t>Фильтрация</w:t>
+      </w:r>
+      <w:proofErr w:type="spellEnd"/>
+      <w:r>
+        <w:rPr>
+          <w:rStyle w:val="HTML1"/>
+          <w:rFonts w:eastAsiaTheme="minorHAnsi"/>
+          <w:kern w:val="0"/>
+          <w:lang w:val="en-US" w:eastAsia="ru-RU"/>
+          <w14:ligatures w14:val="none"/>
+        </w:rPr>
+        <w:t xml:space="preserve"> (</w:t>
+      </w:r>
+      <w:proofErr w:type="spellStart"/>
+      <w:r>
+        <w:rPr>
+          <w:rStyle w:val="HTML1"/>
+          <w:rFonts w:eastAsiaTheme="minorHAnsi"/>
+          <w:kern w:val="0"/>
+          <w:lang w:val="en-US" w:eastAsia="ru-RU"/>
+          <w14:ligatures w14:val="none"/>
+        </w:rPr>
+        <w:t>DataManager.filter_data</w:t>
+      </w:r>
+      <w:proofErr w:type="spellEnd"/>
+      <w:r>
+        <w:rPr>
+          <w:rStyle w:val="HTML1"/>
+          <w:rFonts w:eastAsiaTheme="minorHAnsi"/>
+          <w:kern w:val="0"/>
+          <w:lang w:val="en-US" w:eastAsia="ru-RU"/>
+          <w14:ligatures w14:val="none"/>
+        </w:rPr>
+        <w:t>)</w:t>
+      </w:r>
+    </w:p>
+    <w:p>
+      <w:pPr>
+        <w:rPr>
+          <w:rStyle w:val="HTML1"/>
+          <w:rFonts w:eastAsiaTheme="minorHAnsi"/>
+          <w:kern w:val="0"/>
+          <w:lang w:val="en-US" w:eastAsia="ru-RU"/>
+          <w14:ligatures w14:val="none"/>
+        </w:rPr>
+      </w:pPr>
+      <w:r>
+        <w:rPr>
+          <w:rStyle w:val="HTML1"/>
+          <w:rFonts w:eastAsiaTheme="minorHAnsi"/>
+          <w:kern w:val="0"/>
+          <w:lang w:val="en-US" w:eastAsia="ru-RU"/>
+          <w14:ligatures w14:val="none"/>
+        </w:rPr>
+        <w:t xml:space="preserve">    ↓</w:t>
+      </w:r>
+    </w:p>
+    <w:p>
+      <w:pPr>
+        <w:rPr>
+          <w:rStyle w:val="HTML1"/>
+          <w:rFonts w:eastAsiaTheme="minorHAnsi"/>
+          <w:kern w:val="0"/>
+          <w:lang w:val="en-US" w:eastAsia="ru-RU"/>
+          <w14:ligatures w14:val="none"/>
+        </w:rPr>
+      </w:pPr>
+      <w:proofErr w:type="spellStart"/>
+      <w:r>
+        <w:rPr>
+          <w:rStyle w:val="HTML1"/>
+          <w:rFonts w:eastAsiaTheme="minorHAnsi"/>
+          <w:kern w:val="0"/>
+          <w:lang w:val="en-US" w:eastAsia="ru-RU"/>
+          <w14:ligatures w14:val="none"/>
+        </w:rPr>
+        <w:t>filtered_df</w:t>
+      </w:r>
+      <w:proofErr w:type="spellEnd"/>
+    </w:p>
+    <w:p>
+      <w:pPr>
+        <w:rPr>
+          <w:rStyle w:val="HTML1"/>
+          <w:rFonts w:eastAsiaTheme="minorHAnsi"/>
+          <w:kern w:val="0"/>
+          <w:lang w:val="en-US" w:eastAsia="ru-RU"/>
+          <w14:ligatures w14:val="none"/>
+        </w:rPr>
+      </w:pPr>
+      <w:r>
+        <w:rPr>
+          <w:rStyle w:val="HTML1"/>
+          <w:rFonts w:eastAsiaTheme="minorHAnsi"/>
+          <w:kern w:val="0"/>
+          <w:lang w:val="en-US" w:eastAsia="ru-RU"/>
+          <w14:ligatures w14:val="none"/>
+        </w:rPr>
+        <w:t xml:space="preserve">    ↓</w:t>
+      </w:r>
+    </w:p>
+    <w:p>
+      <w:pPr>
+        <w:rPr>
+          <w:rStyle w:val="HTML1"/>
+          <w:rFonts w:eastAsiaTheme="minorHAnsi"/>
+          <w:kern w:val="0"/>
+          <w:lang w:val="en-US" w:eastAsia="ru-RU"/>
+          <w14:ligatures w14:val="none"/>
+        </w:rPr>
+      </w:pPr>
+      <w:r>
+        <w:rPr>
+          <w:rStyle w:val="HTML1"/>
+          <w:rFonts w:eastAsiaTheme="minorHAnsi"/>
+          <w:kern w:val="0"/>
+          <w:lang w:val="en-US" w:eastAsia="ru-RU"/>
+          <w14:ligatures w14:val="none"/>
+        </w:rPr>
+        <w:t xml:space="preserve"> ┌─────────────────┬──────────────────┐</w:t>
+      </w:r>
+    </w:p>
+    <w:p>
+      <w:pPr>
+        <w:rPr>
+          <w:rStyle w:val="HTML1"/>
+          <w:rFonts w:eastAsiaTheme="minorHAnsi"/>
+          <w:kern w:val="0"/>
+          <w:lang w:val="en-US" w:eastAsia="ru-RU"/>
+          <w14:ligatures w14:val="none"/>
+        </w:rPr>
+      </w:pPr>
+      <w:r>
+        <w:rPr>
+          <w:rStyle w:val="HTML1"/>
+          <w:rFonts w:eastAsiaTheme="minorHAnsi"/>
+          <w:kern w:val="0"/>
+          <w:lang w:val="en-US" w:eastAsia="ru-RU"/>
+          <w14:ligatures w14:val="none"/>
+        </w:rPr>
+        <w:t xml:space="preserve"> ↓                 ↓                  ↓</w:t>
+      </w:r>
+    </w:p>
+    <w:p>
+      <w:pPr>
+        <w:rPr>
+          <w:rStyle w:val="HTML1"/>
+          <w:rFonts w:eastAsiaTheme="minorHAnsi"/>
+          <w:kern w:val="0"/>
+          <w:lang w:val="en-US" w:eastAsia="ru-RU"/>
+          <w14:ligatures w14:val="none"/>
+        </w:rPr>
+      </w:pPr>
+      <w:r>
+        <w:rPr>
+          <w:rStyle w:val="HTML1"/>
+          <w:rFonts w:eastAsiaTheme="minorHAnsi"/>
+          <w:kern w:val="0"/>
+          <w:lang w:val="en-US" w:eastAsia="ru-RU"/>
+          <w14:ligatures w14:val="none"/>
+        </w:rPr>
+        <w:t xml:space="preserve">KPI             </w:t>
+      </w:r>
+      <w:proofErr w:type="spellStart"/>
+      <w:r>
+        <w:rPr>
+          <w:rStyle w:val="HTML1"/>
+          <w:rFonts w:eastAsiaTheme="minorHAnsi"/>
+          <w:kern w:val="0"/>
+          <w:lang w:val="en-US" w:eastAsia="ru-RU"/>
+          <w14:ligatures w14:val="none"/>
+        </w:rPr>
+        <w:t>Таблица</w:t>
+      </w:r>
+      <w:proofErr w:type="spellEnd"/>
+      <w:r>
+        <w:rPr>
+          <w:rStyle w:val="HTML1"/>
+          <w:rFonts w:eastAsiaTheme="minorHAnsi"/>
+          <w:kern w:val="0"/>
+          <w:lang w:val="en-US" w:eastAsia="ru-RU"/>
+          <w14:ligatures w14:val="none"/>
+        </w:rPr>
+        <w:t xml:space="preserve">            </w:t>
+      </w:r>
+      <w:proofErr w:type="spellStart"/>
+      <w:r>
+        <w:rPr>
+          <w:rStyle w:val="HTML1"/>
+          <w:rFonts w:eastAsiaTheme="minorHAnsi"/>
+          <w:kern w:val="0"/>
+          <w:lang w:val="en-US" w:eastAsia="ru-RU"/>
+          <w14:ligatures w14:val="none"/>
+        </w:rPr>
+        <w:t>Графики</w:t>
+      </w:r>
+      <w:proofErr w:type="spellEnd"/>
+    </w:p>
+    <w:p>
+      <w:pPr>
+        <w:rPr>
+          <w:rStyle w:val="HTML1"/>
+          <w:rFonts w:eastAsiaTheme="minorHAnsi"/>
+          <w:kern w:val="0"/>
+          <w:lang w:val="en-US" w:eastAsia="ru-RU"/>
+          <w14:ligatures w14:val="none"/>
+        </w:rPr>
+      </w:pPr>
+      <w:r>
+        <w:rPr>
+          <w:rStyle w:val="HTML1"/>
+          <w:rFonts w:eastAsiaTheme="minorHAnsi"/>
+          <w:kern w:val="0"/>
+          <w:lang w:val="en-US" w:eastAsia="ru-RU"/>
+          <w14:ligatures w14:val="none"/>
+        </w:rPr>
+        <w:t xml:space="preserve"> ↓                 ↓                  ↓</w:t>
+      </w:r>
+    </w:p>
+    <w:p>
+      <w:pPr>
+        <w:rPr>
+          <w:rStyle w:val="HTML1"/>
+          <w:rFonts w:eastAsiaTheme="minorHAnsi"/>
+          <w:kern w:val="0"/>
+          <w:lang w:val="en-US" w:eastAsia="ru-RU"/>
+          <w14:ligatures w14:val="none"/>
+        </w:rPr>
+      </w:pPr>
+      <w:proofErr w:type="spellStart"/>
+      <w:r>
+        <w:rPr>
+          <w:rStyle w:val="HTML1"/>
+          <w:rFonts w:eastAsiaTheme="minorHAnsi"/>
+          <w:kern w:val="0"/>
+          <w:lang w:val="en-US" w:eastAsia="ru-RU"/>
+          <w14:ligatures w14:val="none"/>
+        </w:rPr>
+        <w:t>DataManager</w:t>
+      </w:r>
+      <w:proofErr w:type="spellEnd"/>
+      <w:r>
+        <w:rPr>
+          <w:rStyle w:val="HTML1"/>
+          <w:rFonts w:eastAsiaTheme="minorHAnsi"/>
+          <w:kern w:val="0"/>
+          <w:lang w:val="en-US" w:eastAsia="ru-RU"/>
+          <w14:ligatures w14:val="none"/>
+        </w:rPr>
+        <w:t xml:space="preserve">     </w:t>
+      </w:r>
+      <w:proofErr w:type="spellStart"/>
+      <w:r>
+        <w:rPr>
+          <w:rStyle w:val="HTML1"/>
+          <w:rFonts w:eastAsiaTheme="minorHAnsi"/>
+          <w:kern w:val="0"/>
+          <w:lang w:val="en-US" w:eastAsia="ru-RU"/>
+          <w14:ligatures w14:val="none"/>
+        </w:rPr>
+        <w:t>Treeview</w:t>
+      </w:r>
+      <w:proofErr w:type="spellEnd"/>
+      <w:r>
+        <w:rPr>
+          <w:rStyle w:val="HTML1"/>
+          <w:rFonts w:eastAsiaTheme="minorHAnsi"/>
+          <w:kern w:val="0"/>
+          <w:lang w:val="en-US" w:eastAsia="ru-RU"/>
+          <w14:ligatures w14:val="none"/>
+        </w:rPr>
+        <w:t xml:space="preserve">         </w:t>
+      </w:r>
+      <w:proofErr w:type="spellStart"/>
+      <w:r>
+        <w:rPr>
+          <w:rStyle w:val="HTML1"/>
+          <w:rFonts w:eastAsiaTheme="minorHAnsi"/>
+          <w:kern w:val="0"/>
+          <w:lang w:val="en-US" w:eastAsia="ru-RU"/>
+          <w14:ligatures w14:val="none"/>
+        </w:rPr>
+        <w:t>PlotManager</w:t>
+      </w:r>
+      <w:proofErr w:type="spellEnd"/>
+    </w:p>
+    <w:p>
+      <w:pPr>
+        <w:rPr>
+          <w:rStyle w:val="HTML1"/>
+          <w:rFonts w:eastAsiaTheme="majorEastAsia"/>
+          <w:kern w:val="0"/>
+          <w:lang w:val="en-US" w:eastAsia="ru-RU"/>
+          <w14:ligatures w14:val="none"/>
+        </w:rPr>
+      </w:pPr>
+      <w:proofErr w:type="gramStart"/>
+      <w:r>
+        <w:rPr>
+          <w:rStyle w:val="HTML1"/>
+          <w:rFonts w:eastAsiaTheme="minorHAnsi"/>
+          <w:kern w:val="0"/>
+          <w:lang w:val="en-US" w:eastAsia="ru-RU"/>
+          <w14:ligatures w14:val="none"/>
+        </w:rPr>
+        <w:t>.</w:t>
+      </w:r>
+      <w:proofErr w:type="spellStart"/>
+      <w:r>
+        <w:rPr>
+          <w:rStyle w:val="HTML1"/>
+          <w:rFonts w:eastAsiaTheme="minorHAnsi"/>
+          <w:kern w:val="0"/>
+          <w:lang w:val="en-US" w:eastAsia="ru-RU"/>
+          <w14:ligatures w14:val="none"/>
+        </w:rPr>
+        <w:t>get</w:t>
+      </w:r>
+      <w:proofErr w:type="gramEnd"/>
+      <w:r>
+        <w:rPr>
+          <w:rStyle w:val="HTML1"/>
+          <w:rFonts w:eastAsiaTheme="minorHAnsi"/>
+          <w:kern w:val="0"/>
+          <w:lang w:val="en-US" w:eastAsia="ru-RU"/>
+          <w14:ligatures w14:val="none"/>
+        </w:rPr>
+        <w:t>_statistics</w:t>
+      </w:r>
+      <w:proofErr w:type="spellEnd"/>
+      <w:r>
+        <w:rPr>
+          <w:rStyle w:val="HTML1"/>
+          <w:rFonts w:eastAsiaTheme="minorHAnsi"/>
+          <w:kern w:val="0"/>
+          <w:lang w:val="en-US" w:eastAsia="ru-RU"/>
+          <w14:ligatures w14:val="none"/>
+        </w:rPr>
+        <w:t xml:space="preserve">()            </w:t>
+      </w:r>
+      <w:r>
+        <w:rPr>
+          <w:rStyle w:val="HTML1"/>
+          <w:rFonts w:eastAsiaTheme="minorHAnsi"/>
+          <w:kern w:val="0"/>
+          <w:lang w:val="en-US" w:eastAsia="ru-RU"/>
+          <w14:ligatures w14:val="none"/>
+        </w:rPr>
+        <w:t xml:space="preserve">   </w:t>
+      </w:r>
+      <w:r>
+        <w:rPr>
+          <w:rStyle w:val="HTML1"/>
+          <w:rFonts w:eastAsiaTheme="minorHAnsi"/>
+          <w:kern w:val="0"/>
+          <w:lang w:val="en-US" w:eastAsia="ru-RU"/>
+          <w14:ligatures w14:val="none"/>
+        </w:rPr>
+        <w:t xml:space="preserve"> (matplotlib)</w:t>
+      </w:r>
+    </w:p>
+    <w:p>
+      <w:pPr>
         <w:pStyle w:val="2"/>
         <w:rPr>
           <w:rFonts w:ascii="Times New Roman" w:hAnsi="Times New Roman" w:cs="Times New Roman"/>
@@ -2084,7 +2414,7 @@
           <w:szCs w:val="28"/>
         </w:rPr>
       </w:pPr>
-      <w:bookmarkStart w:id="8" w:name="_Toc232467560"/>
+      <w:bookmarkStart w:id="7" w:name="_Toc232852866"/>
       <w:r>
         <w:rPr>
           <w:rFonts w:ascii="Times New Roman" w:hAnsi="Times New Roman" w:cs="Times New Roman"/>
@@ -2093,7 +2423,7 @@
         </w:rPr>
         <w:t>4. Используемые технологии</w:t>
       </w:r>
-      <w:bookmarkEnd w:id="8"/>
+      <w:bookmarkEnd w:id="7"/>
     </w:p>
     <w:p>
       <w:pPr>
@@ -2212,7 +2542,7 @@
           <w:szCs w:val="28"/>
         </w:rPr>
       </w:pPr>
-      <w:bookmarkStart w:id="9" w:name="_Toc232467561"/>
+      <w:bookmarkStart w:id="8" w:name="_Toc232852867"/>
       <w:r>
         <w:rPr>
           <w:rFonts w:ascii="Times New Roman" w:hAnsi="Times New Roman" w:cs="Times New Roman"/>
@@ -2221,7 +2551,7 @@
         </w:rPr>
         <w:t>5. Заключение</w:t>
       </w:r>
-      <w:bookmarkEnd w:id="9"/>
+      <w:bookmarkEnd w:id="8"/>
     </w:p>
     <w:p>
       <w:pPr>

</xml_diff>